<commit_message>
Update Module 3 assignment with ERD
</commit_message>
<xml_diff>
--- a/module-3/Rigonios-Module3-Assignment.docx
+++ b/module-3/Rigonios-Module3-Assignment.docx
@@ -24,6 +24,46 @@
       </w:r>
       <w:r>
         <w:br/>
+      </w:r>
+      <w:r>
+        <w:rPr>
+          <w:noProof/>
+        </w:rPr>
+        <w:drawing>
+          <wp:inline distT="0" distB="0" distL="0" distR="0" wp14:anchorId="0E322E01" wp14:editId="7925E0FE">
+            <wp:extent cx="5486400" cy="3738245"/>
+            <wp:effectExtent l="0" t="0" r="0" b="0"/>
+            <wp:docPr id="2022522050" name="Picture 1"/>
+            <wp:cNvGraphicFramePr>
+              <a:graphicFrameLocks xmlns:a="http://schemas.openxmlformats.org/drawingml/2006/main" noChangeAspect="1"/>
+            </wp:cNvGraphicFramePr>
+            <a:graphic xmlns:a="http://schemas.openxmlformats.org/drawingml/2006/main">
+              <a:graphicData uri="http://schemas.openxmlformats.org/drawingml/2006/picture">
+                <pic:pic xmlns:pic="http://schemas.openxmlformats.org/drawingml/2006/picture">
+                  <pic:nvPicPr>
+                    <pic:cNvPr id="2022522050" name=""/>
+                    <pic:cNvPicPr/>
+                  </pic:nvPicPr>
+                  <pic:blipFill>
+                    <a:blip r:embed="rId6"/>
+                    <a:stretch>
+                      <a:fillRect/>
+                    </a:stretch>
+                  </pic:blipFill>
+                  <pic:spPr>
+                    <a:xfrm>
+                      <a:off x="0" y="0"/>
+                      <a:ext cx="5486400" cy="3738245"/>
+                    </a:xfrm>
+                    <a:prstGeom prst="rect">
+                      <a:avLst/>
+                    </a:prstGeom>
+                  </pic:spPr>
+                </pic:pic>
+              </a:graphicData>
+            </a:graphic>
+          </wp:inline>
+        </w:drawing>
       </w:r>
     </w:p>
     <w:p>
@@ -127,6 +167,7 @@
     <w:p/>
     <w:p>
       <w:r>
+        <w:lastRenderedPageBreak/>
         <w:t>Book Table</w:t>
       </w:r>
     </w:p>
@@ -297,10 +338,13 @@
             <w:tcW w:w="4320" w:type="dxa"/>
           </w:tcPr>
           <w:p>
+            <w:proofErr w:type="spellStart"/>
             <w:r>
               <w:t>author_ID</w:t>
             </w:r>
+            <w:proofErr w:type="spellEnd"/>
           </w:p>
+          <w:p/>
         </w:tc>
       </w:tr>
     </w:tbl>

</xml_diff>